<commit_message>
Docs: merge new design and task files into one set; add memory-proof tasks and Audit view
</commit_message>
<xml_diff>
--- a/docs/Trading-Bots-Dashboard-Build-Guide.docx
+++ b/docs/Trading-Bots-Dashboard-Build-Guide.docx
@@ -46,7 +46,7 @@
           <w:sz w:val="21"/>
           <w:szCs w:val="21"/>
         </w:rPr>
-        <w:t xml:space="preserve">Version 1, 7 October 2026. Companion to DESIGN.md and TASKS.md (the bots). This document answers how the web dashboard is built; the detailed spec and task list are in the Markdown files listed in section 9.</w:t>
+        <w:t xml:space="preserve">Version 1, 7 October 2026. Companion to DESIGN.md and TASKS.md (the bots). This document answers how the web dashboard is built; the detailed spec and task list are in the Markdown files listed in section 10.</w:t>
       </w:r>
     </w:p>
     <w:p>
@@ -124,7 +124,7 @@
           <w:sz w:val="21"/>
           <w:szCs w:val="21"/>
         </w:rPr>
-        <w:t xml:space="preserve">add anthropics/skills@frontend-design to the repo so Claude Code in VS Code uses it for every screen. Install steps are in section 8.</w:t>
+        <w:t xml:space="preserve">add anthropics/skills@frontend-design to the repo so Claude Code in VS Code uses it for every screen. Install steps are in section 9.</w:t>
       </w:r>
     </w:p>
     <w:p>
@@ -2387,7 +2387,1064 @@
           <w:sz w:val="32"/>
           <w:szCs w:val="32"/>
         </w:rPr>
-        <w:t xml:space="preserve">7. Build plan</w:t>
+        <w:t xml:space="preserve">7. Observability and audit log</w:t>
+      </w:r>
+    </w:p>
+    <w:p>
+      <w:pPr>
+        <w:spacing w:after="120" w:line="300"/>
+      </w:pPr>
+      <w:r>
+        <w:rPr>
+          <w:rFonts w:ascii="Arial" w:cs="Arial" w:eastAsia="Arial" w:hAnsi="Arial"/>
+          <w:color w:val="1F2933"/>
+          <w:sz w:val="21"/>
+          <w:szCs w:val="21"/>
+        </w:rPr>
+        <w:t xml:space="preserve">Added after an architecture review. The detail is in DESIGN.md sections 13.2, 13.3 and 18; the dashboard only reads this data.</w:t>
+      </w:r>
+    </w:p>
+    <w:p>
+      <w:pPr>
+        <w:pStyle w:val="ListParagraph"/>
+        <w:numPr>
+          <w:ilvl w:val="0"/>
+          <w:numId w:val="2"/>
+        </w:numPr>
+        <w:spacing w:after="80" w:line="290"/>
+      </w:pPr>
+      <w:r>
+        <w:rPr>
+          <w:rFonts w:ascii="Arial" w:cs="Arial" w:eastAsia="Arial" w:hAnsi="Arial"/>
+          <w:b/>
+          <w:bCs/>
+          <w:color w:val="1F2933"/>
+          <w:sz w:val="21"/>
+          <w:szCs w:val="21"/>
+        </w:rPr>
+        <w:t xml:space="preserve">Audit log. </w:t>
+      </w:r>
+      <w:r>
+        <w:rPr>
+          <w:rFonts w:ascii="Arial" w:cs="Arial" w:eastAsia="Arial" w:hAnsi="Arial"/>
+          <w:color w:val="1F2933"/>
+          <w:sz w:val="21"/>
+          <w:szCs w:val="21"/>
+        </w:rPr>
+        <w:t xml:space="preserve">An append-only audit_log collection records every step of a trade: scan result, veto reasons, analyst verdicts, your approval (with your Telegram id), recheck, order, fills, exits and every command or breaker trip. Each event carries the config and code version. Nobody can edit or delete events, including you.</w:t>
+      </w:r>
+    </w:p>
+    <w:p>
+      <w:pPr>
+        <w:pStyle w:val="ListParagraph"/>
+        <w:numPr>
+          <w:ilvl w:val="0"/>
+          <w:numId w:val="2"/>
+        </w:numPr>
+        <w:spacing w:after="80" w:line="290"/>
+      </w:pPr>
+      <w:r>
+        <w:rPr>
+          <w:rFonts w:ascii="Arial" w:cs="Arial" w:eastAsia="Arial" w:hAnsi="Arial"/>
+          <w:b/>
+          <w:bCs/>
+          <w:color w:val="1F2933"/>
+          <w:sz w:val="21"/>
+          <w:szCs w:val="21"/>
+        </w:rPr>
+        <w:t xml:space="preserve">Why it helps. </w:t>
+      </w:r>
+      <w:r>
+        <w:rPr>
+          <w:rFonts w:ascii="Arial" w:cs="Arial" w:eastAsia="Arial" w:hAnsi="Arial"/>
+          <w:color w:val="1F2933"/>
+          <w:sz w:val="21"/>
+          <w:szCs w:val="21"/>
+        </w:rPr>
+        <w:t xml:space="preserve">You can answer why it bought something months later, prove each order followed your approval, find why paper results differ from the backtest, and keep clean records for tax filing.</w:t>
+      </w:r>
+    </w:p>
+    <w:p>
+      <w:pPr>
+        <w:pStyle w:val="ListParagraph"/>
+        <w:numPr>
+          <w:ilvl w:val="0"/>
+          <w:numId w:val="2"/>
+        </w:numPr>
+        <w:spacing w:after="80" w:line="290"/>
+      </w:pPr>
+      <w:r>
+        <w:rPr>
+          <w:rFonts w:ascii="Arial" w:cs="Arial" w:eastAsia="Arial" w:hAnsi="Arial"/>
+          <w:b/>
+          <w:bCs/>
+          <w:color w:val="1F2933"/>
+          <w:sz w:val="21"/>
+          <w:szCs w:val="21"/>
+        </w:rPr>
+        <w:t xml:space="preserve">Observability, sized for one VM. </w:t>
+      </w:r>
+      <w:r>
+        <w:rPr>
+          <w:rFonts w:ascii="Arial" w:cs="Arial" w:eastAsia="Arial" w:hAnsi="Arial"/>
+          <w:color w:val="1F2933"/>
+          <w:sz w:val="21"/>
+          <w:szCs w:val="21"/>
+        </w:rPr>
+        <w:t xml:space="preserve">Structured logs with a plan id on every line, a heartbeat, a handful of metrics with alert thresholds (data freshness, API errors, order latency, reconciliation differences, slippage, AI cost) and Telegram alerts. No tracing stack.</w:t>
+      </w:r>
+    </w:p>
+    <w:p>
+      <w:pPr>
+        <w:pStyle w:val="ListParagraph"/>
+        <w:numPr>
+          <w:ilvl w:val="0"/>
+          <w:numId w:val="2"/>
+        </w:numPr>
+        <w:spacing w:after="80" w:line="290"/>
+      </w:pPr>
+      <w:r>
+        <w:rPr>
+          <w:rFonts w:ascii="Arial" w:cs="Arial" w:eastAsia="Arial" w:hAnsi="Arial"/>
+          <w:b/>
+          <w:bCs/>
+          <w:color w:val="1F2933"/>
+          <w:sz w:val="21"/>
+          <w:szCs w:val="21"/>
+        </w:rPr>
+        <w:t xml:space="preserve">Outside dead-man ping. </w:t>
+      </w:r>
+      <w:r>
+        <w:rPr>
+          <w:rFonts w:ascii="Arial" w:cs="Arial" w:eastAsia="Arial" w:hAnsi="Arial"/>
+          <w:color w:val="1F2933"/>
+          <w:sz w:val="21"/>
+          <w:szCs w:val="21"/>
+        </w:rPr>
+        <w:t xml:space="preserve">A free external check is pinged on every heartbeat and messages you when pings stop, because a dead VM cannot alert you itself.</w:t>
+      </w:r>
+    </w:p>
+    <w:p>
+      <w:pPr>
+        <w:pStyle w:val="ListParagraph"/>
+        <w:numPr>
+          <w:ilvl w:val="0"/>
+          <w:numId w:val="2"/>
+        </w:numPr>
+        <w:spacing w:after="80" w:line="290"/>
+      </w:pPr>
+      <w:r>
+        <w:rPr>
+          <w:rFonts w:ascii="Arial" w:cs="Arial" w:eastAsia="Arial" w:hAnsi="Arial"/>
+          <w:b/>
+          <w:bCs/>
+          <w:color w:val="1F2933"/>
+          <w:sz w:val="21"/>
+          <w:szCs w:val="21"/>
+        </w:rPr>
+        <w:t xml:space="preserve">Dashboard. </w:t>
+      </w:r>
+      <w:r>
+        <w:rPr>
+          <w:rFonts w:ascii="Arial" w:cs="Arial" w:eastAsia="Arial" w:hAnsi="Arial"/>
+          <w:color w:val="1F2933"/>
+          <w:sz w:val="21"/>
+          <w:szCs w:val="21"/>
+        </w:rPr>
+        <w:t xml:space="preserve">A read-only Audit view (stage D9) shows the event timeline for a plan or trade, with paged reads.</w:t>
+      </w:r>
+    </w:p>
+    <w:p>
+      <w:pPr>
+        <w:spacing w:after="120" w:line="300"/>
+      </w:pPr>
+      <w:r>
+        <w:rPr>
+          <w:rFonts w:ascii="Arial" w:cs="Arial" w:eastAsia="Arial" w:hAnsi="Arial"/>
+          <w:color w:val="1F2933"/>
+          <w:sz w:val="21"/>
+          <w:szCs w:val="21"/>
+        </w:rPr>
+        <w:t xml:space="preserve">Architecture review findings, in priority order:</w:t>
+      </w:r>
+    </w:p>
+    <w:tbl>
+      <w:tblPr>
+        <w:tblW w:type="dxa" w:w="9360"/>
+        <w:tblBorders>
+          <w:top w:val="single" w:color="auto" w:sz="4"/>
+          <w:left w:val="single" w:color="auto" w:sz="4"/>
+          <w:bottom w:val="single" w:color="auto" w:sz="4"/>
+          <w:right w:val="single" w:color="auto" w:sz="4"/>
+          <w:insideH w:val="single" w:color="auto" w:sz="4"/>
+          <w:insideV w:val="single" w:color="auto" w:sz="4"/>
+        </w:tblBorders>
+      </w:tblPr>
+      <w:tblGrid>
+        <w:gridCol w:w="500"/>
+        <w:gridCol w:w="3400"/>
+        <w:gridCol w:w="5460"/>
+      </w:tblGrid>
+      <w:tr>
+        <w:trPr>
+          <w:cantSplit/>
+          <w:tblHeader/>
+        </w:trPr>
+        <w:tc>
+          <w:tcPr>
+            <w:tcW w:type="dxa" w:w="500"/>
+            <w:tcBorders>
+              <w:top w:val="single" w:color="D5DAE0" w:sz="4"/>
+              <w:left w:val="single" w:color="D5DAE0" w:sz="4"/>
+              <w:bottom w:val="single" w:color="D5DAE0" w:sz="4"/>
+              <w:right w:val="single" w:color="D5DAE0" w:sz="4"/>
+            </w:tcBorders>
+            <w:shd w:fill="E8F1EE" w:val="clear"/>
+            <w:tcMar>
+              <w:top w:type="dxa" w:w="70"/>
+              <w:left w:type="dxa" w:w="110"/>
+              <w:bottom w:type="dxa" w:w="70"/>
+              <w:right w:type="dxa" w:w="110"/>
+            </w:tcMar>
+          </w:tcPr>
+          <w:p>
+            <w:pPr>
+              <w:spacing w:after="0" w:line="270"/>
+            </w:pPr>
+            <w:r>
+              <w:rPr>
+                <w:rFonts w:ascii="Arial" w:cs="Arial" w:eastAsia="Arial" w:hAnsi="Arial"/>
+                <w:b/>
+                <w:bCs/>
+                <w:color w:val="1F2933"/>
+                <w:sz w:val="19"/>
+                <w:szCs w:val="19"/>
+              </w:rPr>
+              <w:t xml:space="preserve">#</w:t>
+            </w:r>
+          </w:p>
+        </w:tc>
+        <w:tc>
+          <w:tcPr>
+            <w:tcW w:type="dxa" w:w="3400"/>
+            <w:tcBorders>
+              <w:top w:val="single" w:color="D5DAE0" w:sz="4"/>
+              <w:left w:val="single" w:color="D5DAE0" w:sz="4"/>
+              <w:bottom w:val="single" w:color="D5DAE0" w:sz="4"/>
+              <w:right w:val="single" w:color="D5DAE0" w:sz="4"/>
+            </w:tcBorders>
+            <w:shd w:fill="E8F1EE" w:val="clear"/>
+            <w:tcMar>
+              <w:top w:type="dxa" w:w="70"/>
+              <w:left w:type="dxa" w:w="110"/>
+              <w:bottom w:type="dxa" w:w="70"/>
+              <w:right w:type="dxa" w:w="110"/>
+            </w:tcMar>
+          </w:tcPr>
+          <w:p>
+            <w:pPr>
+              <w:spacing w:after="0" w:line="270"/>
+            </w:pPr>
+            <w:r>
+              <w:rPr>
+                <w:rFonts w:ascii="Arial" w:cs="Arial" w:eastAsia="Arial" w:hAnsi="Arial"/>
+                <w:b/>
+                <w:bCs/>
+                <w:color w:val="1F2933"/>
+                <w:sz w:val="19"/>
+                <w:szCs w:val="19"/>
+              </w:rPr>
+              <w:t xml:space="preserve">Finding</w:t>
+            </w:r>
+          </w:p>
+        </w:tc>
+        <w:tc>
+          <w:tcPr>
+            <w:tcW w:type="dxa" w:w="5460"/>
+            <w:tcBorders>
+              <w:top w:val="single" w:color="D5DAE0" w:sz="4"/>
+              <w:left w:val="single" w:color="D5DAE0" w:sz="4"/>
+              <w:bottom w:val="single" w:color="D5DAE0" w:sz="4"/>
+              <w:right w:val="single" w:color="D5DAE0" w:sz="4"/>
+            </w:tcBorders>
+            <w:shd w:fill="E8F1EE" w:val="clear"/>
+            <w:tcMar>
+              <w:top w:type="dxa" w:w="70"/>
+              <w:left w:type="dxa" w:w="110"/>
+              <w:bottom w:type="dxa" w:w="70"/>
+              <w:right w:type="dxa" w:w="110"/>
+            </w:tcMar>
+          </w:tcPr>
+          <w:p>
+            <w:pPr>
+              <w:spacing w:after="0" w:line="270"/>
+            </w:pPr>
+            <w:r>
+              <w:rPr>
+                <w:rFonts w:ascii="Arial" w:cs="Arial" w:eastAsia="Arial" w:hAnsi="Arial"/>
+                <w:b/>
+                <w:bCs/>
+                <w:color w:val="1F2933"/>
+                <w:sz w:val="19"/>
+                <w:szCs w:val="19"/>
+              </w:rPr>
+              <w:t xml:space="preserve">Mitigation</w:t>
+            </w:r>
+          </w:p>
+        </w:tc>
+      </w:tr>
+      <w:tr>
+        <w:trPr>
+          <w:cantSplit/>
+          <w:tblHeader w:val="false"/>
+        </w:trPr>
+        <w:tc>
+          <w:tcPr>
+            <w:tcW w:type="dxa" w:w="500"/>
+            <w:tcBorders>
+              <w:top w:val="single" w:color="D5DAE0" w:sz="4"/>
+              <w:left w:val="single" w:color="D5DAE0" w:sz="4"/>
+              <w:bottom w:val="single" w:color="D5DAE0" w:sz="4"/>
+              <w:right w:val="single" w:color="D5DAE0" w:sz="4"/>
+            </w:tcBorders>
+            <w:tcMar>
+              <w:top w:type="dxa" w:w="70"/>
+              <w:left w:type="dxa" w:w="110"/>
+              <w:bottom w:type="dxa" w:w="70"/>
+              <w:right w:type="dxa" w:w="110"/>
+            </w:tcMar>
+          </w:tcPr>
+          <w:p>
+            <w:pPr>
+              <w:spacing w:after="0" w:line="270"/>
+            </w:pPr>
+            <w:r>
+              <w:rPr>
+                <w:rFonts w:ascii="Arial" w:cs="Arial" w:eastAsia="Arial" w:hAnsi="Arial"/>
+                <w:b w:val="false"/>
+                <w:bCs w:val="false"/>
+                <w:color w:val="1F2933"/>
+                <w:sz w:val="19"/>
+                <w:szCs w:val="19"/>
+              </w:rPr>
+              <w:t xml:space="preserve">1</w:t>
+            </w:r>
+          </w:p>
+        </w:tc>
+        <w:tc>
+          <w:tcPr>
+            <w:tcW w:type="dxa" w:w="3400"/>
+            <w:tcBorders>
+              <w:top w:val="single" w:color="D5DAE0" w:sz="4"/>
+              <w:left w:val="single" w:color="D5DAE0" w:sz="4"/>
+              <w:bottom w:val="single" w:color="D5DAE0" w:sz="4"/>
+              <w:right w:val="single" w:color="D5DAE0" w:sz="4"/>
+            </w:tcBorders>
+            <w:tcMar>
+              <w:top w:type="dxa" w:w="70"/>
+              <w:left w:type="dxa" w:w="110"/>
+              <w:bottom w:type="dxa" w:w="70"/>
+              <w:right w:type="dxa" w:w="110"/>
+            </w:tcMar>
+          </w:tcPr>
+          <w:p>
+            <w:pPr>
+              <w:spacing w:after="0" w:line="270"/>
+            </w:pPr>
+            <w:r>
+              <w:rPr>
+                <w:rFonts w:ascii="Arial" w:cs="Arial" w:eastAsia="Arial" w:hAnsi="Arial"/>
+                <w:b w:val="false"/>
+                <w:bCs w:val="false"/>
+                <w:color w:val="1F2933"/>
+                <w:sz w:val="19"/>
+                <w:szCs w:val="19"/>
+              </w:rPr>
+              <w:t xml:space="preserve">Silent failure</w:t>
+            </w:r>
+          </w:p>
+        </w:tc>
+        <w:tc>
+          <w:tcPr>
+            <w:tcW w:type="dxa" w:w="5460"/>
+            <w:tcBorders>
+              <w:top w:val="single" w:color="D5DAE0" w:sz="4"/>
+              <w:left w:val="single" w:color="D5DAE0" w:sz="4"/>
+              <w:bottom w:val="single" w:color="D5DAE0" w:sz="4"/>
+              <w:right w:val="single" w:color="D5DAE0" w:sz="4"/>
+            </w:tcBorders>
+            <w:tcMar>
+              <w:top w:type="dxa" w:w="70"/>
+              <w:left w:type="dxa" w:w="110"/>
+              <w:bottom w:type="dxa" w:w="70"/>
+              <w:right w:type="dxa" w:w="110"/>
+            </w:tcMar>
+          </w:tcPr>
+          <w:p>
+            <w:pPr>
+              <w:spacing w:after="0" w:line="270"/>
+            </w:pPr>
+            <w:r>
+              <w:rPr>
+                <w:rFonts w:ascii="Arial" w:cs="Arial" w:eastAsia="Arial" w:hAnsi="Arial"/>
+                <w:b w:val="false"/>
+                <w:bCs w:val="false"/>
+                <w:color w:val="1F2933"/>
+                <w:sz w:val="19"/>
+                <w:szCs w:val="19"/>
+              </w:rPr>
+              <w:t xml:space="preserve">Outside ping, heartbeat alerts, data-freshness metrics</w:t>
+            </w:r>
+          </w:p>
+        </w:tc>
+      </w:tr>
+      <w:tr>
+        <w:trPr>
+          <w:cantSplit/>
+          <w:tblHeader w:val="false"/>
+        </w:trPr>
+        <w:tc>
+          <w:tcPr>
+            <w:tcW w:type="dxa" w:w="500"/>
+            <w:tcBorders>
+              <w:top w:val="single" w:color="D5DAE0" w:sz="4"/>
+              <w:left w:val="single" w:color="D5DAE0" w:sz="4"/>
+              <w:bottom w:val="single" w:color="D5DAE0" w:sz="4"/>
+              <w:right w:val="single" w:color="D5DAE0" w:sz="4"/>
+            </w:tcBorders>
+            <w:tcMar>
+              <w:top w:type="dxa" w:w="70"/>
+              <w:left w:type="dxa" w:w="110"/>
+              <w:bottom w:type="dxa" w:w="70"/>
+              <w:right w:type="dxa" w:w="110"/>
+            </w:tcMar>
+          </w:tcPr>
+          <w:p>
+            <w:pPr>
+              <w:spacing w:after="0" w:line="270"/>
+            </w:pPr>
+            <w:r>
+              <w:rPr>
+                <w:rFonts w:ascii="Arial" w:cs="Arial" w:eastAsia="Arial" w:hAnsi="Arial"/>
+                <w:b w:val="false"/>
+                <w:bCs w:val="false"/>
+                <w:color w:val="1F2933"/>
+                <w:sz w:val="19"/>
+                <w:szCs w:val="19"/>
+              </w:rPr>
+              <w:t xml:space="preserve">2</w:t>
+            </w:r>
+          </w:p>
+        </w:tc>
+        <w:tc>
+          <w:tcPr>
+            <w:tcW w:type="dxa" w:w="3400"/>
+            <w:tcBorders>
+              <w:top w:val="single" w:color="D5DAE0" w:sz="4"/>
+              <w:left w:val="single" w:color="D5DAE0" w:sz="4"/>
+              <w:bottom w:val="single" w:color="D5DAE0" w:sz="4"/>
+              <w:right w:val="single" w:color="D5DAE0" w:sz="4"/>
+            </w:tcBorders>
+            <w:tcMar>
+              <w:top w:type="dxa" w:w="70"/>
+              <w:left w:type="dxa" w:w="110"/>
+              <w:bottom w:type="dxa" w:w="70"/>
+              <w:right w:type="dxa" w:w="110"/>
+            </w:tcMar>
+          </w:tcPr>
+          <w:p>
+            <w:pPr>
+              <w:spacing w:after="0" w:line="270"/>
+            </w:pPr>
+            <w:r>
+              <w:rPr>
+                <w:rFonts w:ascii="Arial" w:cs="Arial" w:eastAsia="Arial" w:hAnsi="Arial"/>
+                <w:b w:val="false"/>
+                <w:bCs w:val="false"/>
+                <w:color w:val="1F2933"/>
+                <w:sz w:val="19"/>
+                <w:szCs w:val="19"/>
+              </w:rPr>
+              <w:t xml:space="preserve">Crash recovery and duplicate orders</w:t>
+            </w:r>
+          </w:p>
+        </w:tc>
+        <w:tc>
+          <w:tcPr>
+            <w:tcW w:type="dxa" w:w="5460"/>
+            <w:tcBorders>
+              <w:top w:val="single" w:color="D5DAE0" w:sz="4"/>
+              <w:left w:val="single" w:color="D5DAE0" w:sz="4"/>
+              <w:bottom w:val="single" w:color="D5DAE0" w:sz="4"/>
+              <w:right w:val="single" w:color="D5DAE0" w:sz="4"/>
+            </w:tcBorders>
+            <w:tcMar>
+              <w:top w:type="dxa" w:w="70"/>
+              <w:left w:type="dxa" w:w="110"/>
+              <w:bottom w:type="dxa" w:w="70"/>
+              <w:right w:type="dxa" w:w="110"/>
+            </w:tcMar>
+          </w:tcPr>
+          <w:p>
+            <w:pPr>
+              <w:spacing w:after="0" w:line="270"/>
+            </w:pPr>
+            <w:r>
+              <w:rPr>
+                <w:rFonts w:ascii="Arial" w:cs="Arial" w:eastAsia="Arial" w:hAnsi="Arial"/>
+                <w:b w:val="false"/>
+                <w:bCs w:val="false"/>
+                <w:color w:val="1F2933"/>
+                <w:sz w:val="19"/>
+                <w:szCs w:val="19"/>
+              </w:rPr>
+              <w:t xml:space="preserve">State only in Firestore, idempotent client order ids, broker is the source of truth</w:t>
+            </w:r>
+          </w:p>
+        </w:tc>
+      </w:tr>
+      <w:tr>
+        <w:trPr>
+          <w:cantSplit/>
+          <w:tblHeader w:val="false"/>
+        </w:trPr>
+        <w:tc>
+          <w:tcPr>
+            <w:tcW w:type="dxa" w:w="500"/>
+            <w:tcBorders>
+              <w:top w:val="single" w:color="D5DAE0" w:sz="4"/>
+              <w:left w:val="single" w:color="D5DAE0" w:sz="4"/>
+              <w:bottom w:val="single" w:color="D5DAE0" w:sz="4"/>
+              <w:right w:val="single" w:color="D5DAE0" w:sz="4"/>
+            </w:tcBorders>
+            <w:tcMar>
+              <w:top w:type="dxa" w:w="70"/>
+              <w:left w:type="dxa" w:w="110"/>
+              <w:bottom w:type="dxa" w:w="70"/>
+              <w:right w:type="dxa" w:w="110"/>
+            </w:tcMar>
+          </w:tcPr>
+          <w:p>
+            <w:pPr>
+              <w:spacing w:after="0" w:line="270"/>
+            </w:pPr>
+            <w:r>
+              <w:rPr>
+                <w:rFonts w:ascii="Arial" w:cs="Arial" w:eastAsia="Arial" w:hAnsi="Arial"/>
+                <w:b w:val="false"/>
+                <w:bCs w:val="false"/>
+                <w:color w:val="1F2933"/>
+                <w:sz w:val="19"/>
+                <w:szCs w:val="19"/>
+              </w:rPr>
+              <w:t xml:space="preserve">3</w:t>
+            </w:r>
+          </w:p>
+        </w:tc>
+        <w:tc>
+          <w:tcPr>
+            <w:tcW w:type="dxa" w:w="3400"/>
+            <w:tcBorders>
+              <w:top w:val="single" w:color="D5DAE0" w:sz="4"/>
+              <w:left w:val="single" w:color="D5DAE0" w:sz="4"/>
+              <w:bottom w:val="single" w:color="D5DAE0" w:sz="4"/>
+              <w:right w:val="single" w:color="D5DAE0" w:sz="4"/>
+            </w:tcBorders>
+            <w:tcMar>
+              <w:top w:type="dxa" w:w="70"/>
+              <w:left w:type="dxa" w:w="110"/>
+              <w:bottom w:type="dxa" w:w="70"/>
+              <w:right w:type="dxa" w:w="110"/>
+            </w:tcMar>
+          </w:tcPr>
+          <w:p>
+            <w:pPr>
+              <w:spacing w:after="0" w:line="270"/>
+            </w:pPr>
+            <w:r>
+              <w:rPr>
+                <w:rFonts w:ascii="Arial" w:cs="Arial" w:eastAsia="Arial" w:hAnsi="Arial"/>
+                <w:b w:val="false"/>
+                <w:bCs w:val="false"/>
+                <w:color w:val="1F2933"/>
+                <w:sz w:val="19"/>
+                <w:szCs w:val="19"/>
+              </w:rPr>
+              <w:t xml:space="preserve">Trading on stale or missing inputs</w:t>
+            </w:r>
+          </w:p>
+        </w:tc>
+        <w:tc>
+          <w:tcPr>
+            <w:tcW w:type="dxa" w:w="5460"/>
+            <w:tcBorders>
+              <w:top w:val="single" w:color="D5DAE0" w:sz="4"/>
+              <w:left w:val="single" w:color="D5DAE0" w:sz="4"/>
+              <w:bottom w:val="single" w:color="D5DAE0" w:sz="4"/>
+              <w:right w:val="single" w:color="D5DAE0" w:sz="4"/>
+            </w:tcBorders>
+            <w:tcMar>
+              <w:top w:type="dxa" w:w="70"/>
+              <w:left w:type="dxa" w:w="110"/>
+              <w:bottom w:type="dxa" w:w="70"/>
+              <w:right w:type="dxa" w:w="110"/>
+            </w:tcMar>
+          </w:tcPr>
+          <w:p>
+            <w:pPr>
+              <w:spacing w:after="0" w:line="270"/>
+            </w:pPr>
+            <w:r>
+              <w:rPr>
+                <w:rFonts w:ascii="Arial" w:cs="Arial" w:eastAsia="Arial" w:hAnsi="Arial"/>
+                <w:b w:val="false"/>
+                <w:bCs w:val="false"/>
+                <w:color w:val="1F2933"/>
+                <w:sz w:val="19"/>
+                <w:szCs w:val="19"/>
+              </w:rPr>
+              <w:t xml:space="preserve">Fail closed: block new entries and alert</w:t>
+            </w:r>
+          </w:p>
+        </w:tc>
+      </w:tr>
+      <w:tr>
+        <w:trPr>
+          <w:cantSplit/>
+          <w:tblHeader w:val="false"/>
+        </w:trPr>
+        <w:tc>
+          <w:tcPr>
+            <w:tcW w:type="dxa" w:w="500"/>
+            <w:tcBorders>
+              <w:top w:val="single" w:color="D5DAE0" w:sz="4"/>
+              <w:left w:val="single" w:color="D5DAE0" w:sz="4"/>
+              <w:bottom w:val="single" w:color="D5DAE0" w:sz="4"/>
+              <w:right w:val="single" w:color="D5DAE0" w:sz="4"/>
+            </w:tcBorders>
+            <w:tcMar>
+              <w:top w:type="dxa" w:w="70"/>
+              <w:left w:type="dxa" w:w="110"/>
+              <w:bottom w:type="dxa" w:w="70"/>
+              <w:right w:type="dxa" w:w="110"/>
+            </w:tcMar>
+          </w:tcPr>
+          <w:p>
+            <w:pPr>
+              <w:spacing w:after="0" w:line="270"/>
+            </w:pPr>
+            <w:r>
+              <w:rPr>
+                <w:rFonts w:ascii="Arial" w:cs="Arial" w:eastAsia="Arial" w:hAnsi="Arial"/>
+                <w:b w:val="false"/>
+                <w:bCs w:val="false"/>
+                <w:color w:val="1F2933"/>
+                <w:sz w:val="19"/>
+                <w:szCs w:val="19"/>
+              </w:rPr>
+              <w:t xml:space="preserve">4</w:t>
+            </w:r>
+          </w:p>
+        </w:tc>
+        <w:tc>
+          <w:tcPr>
+            <w:tcW w:type="dxa" w:w="3400"/>
+            <w:tcBorders>
+              <w:top w:val="single" w:color="D5DAE0" w:sz="4"/>
+              <w:left w:val="single" w:color="D5DAE0" w:sz="4"/>
+              <w:bottom w:val="single" w:color="D5DAE0" w:sz="4"/>
+              <w:right w:val="single" w:color="D5DAE0" w:sz="4"/>
+            </w:tcBorders>
+            <w:tcMar>
+              <w:top w:type="dxa" w:w="70"/>
+              <w:left w:type="dxa" w:w="110"/>
+              <w:bottom w:type="dxa" w:w="70"/>
+              <w:right w:type="dxa" w:w="110"/>
+            </w:tcMar>
+          </w:tcPr>
+          <w:p>
+            <w:pPr>
+              <w:spacing w:after="0" w:line="270"/>
+            </w:pPr>
+            <w:r>
+              <w:rPr>
+                <w:rFonts w:ascii="Arial" w:cs="Arial" w:eastAsia="Arial" w:hAnsi="Arial"/>
+                <w:b w:val="false"/>
+                <w:bCs w:val="false"/>
+                <w:color w:val="1F2933"/>
+                <w:sz w:val="19"/>
+                <w:szCs w:val="19"/>
+              </w:rPr>
+              <w:t xml:space="preserve">Secrets sprawl</w:t>
+            </w:r>
+          </w:p>
+        </w:tc>
+        <w:tc>
+          <w:tcPr>
+            <w:tcW w:type="dxa" w:w="5460"/>
+            <w:tcBorders>
+              <w:top w:val="single" w:color="D5DAE0" w:sz="4"/>
+              <w:left w:val="single" w:color="D5DAE0" w:sz="4"/>
+              <w:bottom w:val="single" w:color="D5DAE0" w:sz="4"/>
+              <w:right w:val="single" w:color="D5DAE0" w:sz="4"/>
+            </w:tcBorders>
+            <w:tcMar>
+              <w:top w:type="dxa" w:w="70"/>
+              <w:left w:type="dxa" w:w="110"/>
+              <w:bottom w:type="dxa" w:w="70"/>
+              <w:right w:type="dxa" w:w="110"/>
+            </w:tcMar>
+          </w:tcPr>
+          <w:p>
+            <w:pPr>
+              <w:spacing w:after="0" w:line="270"/>
+            </w:pPr>
+            <w:r>
+              <w:rPr>
+                <w:rFonts w:ascii="Arial" w:cs="Arial" w:eastAsia="Arial" w:hAnsi="Arial"/>
+                <w:b w:val="false"/>
+                <w:bCs w:val="false"/>
+                <w:color w:val="1F2933"/>
+                <w:sz w:val="19"/>
+                <w:szCs w:val="19"/>
+              </w:rPr>
+              <w:t xml:space="preserve">Secret Manager, separate keys per purpose, rotate by create, switch, delete</w:t>
+            </w:r>
+          </w:p>
+        </w:tc>
+      </w:tr>
+      <w:tr>
+        <w:trPr>
+          <w:cantSplit/>
+          <w:tblHeader w:val="false"/>
+        </w:trPr>
+        <w:tc>
+          <w:tcPr>
+            <w:tcW w:type="dxa" w:w="500"/>
+            <w:tcBorders>
+              <w:top w:val="single" w:color="D5DAE0" w:sz="4"/>
+              <w:left w:val="single" w:color="D5DAE0" w:sz="4"/>
+              <w:bottom w:val="single" w:color="D5DAE0" w:sz="4"/>
+              <w:right w:val="single" w:color="D5DAE0" w:sz="4"/>
+            </w:tcBorders>
+            <w:tcMar>
+              <w:top w:type="dxa" w:w="70"/>
+              <w:left w:type="dxa" w:w="110"/>
+              <w:bottom w:type="dxa" w:w="70"/>
+              <w:right w:type="dxa" w:w="110"/>
+            </w:tcMar>
+          </w:tcPr>
+          <w:p>
+            <w:pPr>
+              <w:spacing w:after="0" w:line="270"/>
+            </w:pPr>
+            <w:r>
+              <w:rPr>
+                <w:rFonts w:ascii="Arial" w:cs="Arial" w:eastAsia="Arial" w:hAnsi="Arial"/>
+                <w:b w:val="false"/>
+                <w:bCs w:val="false"/>
+                <w:color w:val="1F2933"/>
+                <w:sz w:val="19"/>
+                <w:szCs w:val="19"/>
+              </w:rPr>
+              <w:t xml:space="preserve">5</w:t>
+            </w:r>
+          </w:p>
+        </w:tc>
+        <w:tc>
+          <w:tcPr>
+            <w:tcW w:type="dxa" w:w="3400"/>
+            <w:tcBorders>
+              <w:top w:val="single" w:color="D5DAE0" w:sz="4"/>
+              <w:left w:val="single" w:color="D5DAE0" w:sz="4"/>
+              <w:bottom w:val="single" w:color="D5DAE0" w:sz="4"/>
+              <w:right w:val="single" w:color="D5DAE0" w:sz="4"/>
+            </w:tcBorders>
+            <w:tcMar>
+              <w:top w:type="dxa" w:w="70"/>
+              <w:left w:type="dxa" w:w="110"/>
+              <w:bottom w:type="dxa" w:w="70"/>
+              <w:right w:type="dxa" w:w="110"/>
+            </w:tcMar>
+          </w:tcPr>
+          <w:p>
+            <w:pPr>
+              <w:spacing w:after="0" w:line="270"/>
+            </w:pPr>
+            <w:r>
+              <w:rPr>
+                <w:rFonts w:ascii="Arial" w:cs="Arial" w:eastAsia="Arial" w:hAnsi="Arial"/>
+                <w:b w:val="false"/>
+                <w:bCs w:val="false"/>
+                <w:color w:val="1F2933"/>
+                <w:sz w:val="19"/>
+                <w:szCs w:val="19"/>
+              </w:rPr>
+              <w:t xml:space="preserve">Single VM</w:t>
+            </w:r>
+          </w:p>
+        </w:tc>
+        <w:tc>
+          <w:tcPr>
+            <w:tcW w:type="dxa" w:w="5460"/>
+            <w:tcBorders>
+              <w:top w:val="single" w:color="D5DAE0" w:sz="4"/>
+              <w:left w:val="single" w:color="D5DAE0" w:sz="4"/>
+              <w:bottom w:val="single" w:color="D5DAE0" w:sz="4"/>
+              <w:right w:val="single" w:color="D5DAE0" w:sz="4"/>
+            </w:tcBorders>
+            <w:tcMar>
+              <w:top w:type="dxa" w:w="70"/>
+              <w:left w:type="dxa" w:w="110"/>
+              <w:bottom w:type="dxa" w:w="70"/>
+              <w:right w:type="dxa" w:w="110"/>
+            </w:tcMar>
+          </w:tcPr>
+          <w:p>
+            <w:pPr>
+              <w:spacing w:after="0" w:line="270"/>
+            </w:pPr>
+            <w:r>
+              <w:rPr>
+                <w:rFonts w:ascii="Arial" w:cs="Arial" w:eastAsia="Arial" w:hAnsi="Arial"/>
+                <w:b w:val="false"/>
+                <w:bCs w:val="false"/>
+                <w:color w:val="1F2933"/>
+                <w:sz w:val="19"/>
+                <w:szCs w:val="19"/>
+              </w:rPr>
+              <w:t xml:space="preserve">Runbook, snapshot, game day; stop orders live at the broker</w:t>
+            </w:r>
+          </w:p>
+        </w:tc>
+      </w:tr>
+      <w:tr>
+        <w:trPr>
+          <w:cantSplit/>
+          <w:tblHeader w:val="false"/>
+        </w:trPr>
+        <w:tc>
+          <w:tcPr>
+            <w:tcW w:type="dxa" w:w="500"/>
+            <w:tcBorders>
+              <w:top w:val="single" w:color="D5DAE0" w:sz="4"/>
+              <w:left w:val="single" w:color="D5DAE0" w:sz="4"/>
+              <w:bottom w:val="single" w:color="D5DAE0" w:sz="4"/>
+              <w:right w:val="single" w:color="D5DAE0" w:sz="4"/>
+            </w:tcBorders>
+            <w:tcMar>
+              <w:top w:type="dxa" w:w="70"/>
+              <w:left w:type="dxa" w:w="110"/>
+              <w:bottom w:type="dxa" w:w="70"/>
+              <w:right w:type="dxa" w:w="110"/>
+            </w:tcMar>
+          </w:tcPr>
+          <w:p>
+            <w:pPr>
+              <w:spacing w:after="0" w:line="270"/>
+            </w:pPr>
+            <w:r>
+              <w:rPr>
+                <w:rFonts w:ascii="Arial" w:cs="Arial" w:eastAsia="Arial" w:hAnsi="Arial"/>
+                <w:b w:val="false"/>
+                <w:bCs w:val="false"/>
+                <w:color w:val="1F2933"/>
+                <w:sz w:val="19"/>
+                <w:szCs w:val="19"/>
+              </w:rPr>
+              <w:t xml:space="preserve">6</w:t>
+            </w:r>
+          </w:p>
+        </w:tc>
+        <w:tc>
+          <w:tcPr>
+            <w:tcW w:type="dxa" w:w="3400"/>
+            <w:tcBorders>
+              <w:top w:val="single" w:color="D5DAE0" w:sz="4"/>
+              <w:left w:val="single" w:color="D5DAE0" w:sz="4"/>
+              <w:bottom w:val="single" w:color="D5DAE0" w:sz="4"/>
+              <w:right w:val="single" w:color="D5DAE0" w:sz="4"/>
+            </w:tcBorders>
+            <w:tcMar>
+              <w:top w:type="dxa" w:w="70"/>
+              <w:left w:type="dxa" w:w="110"/>
+              <w:bottom w:type="dxa" w:w="70"/>
+              <w:right w:type="dxa" w:w="110"/>
+            </w:tcMar>
+          </w:tcPr>
+          <w:p>
+            <w:pPr>
+              <w:spacing w:after="0" w:line="270"/>
+            </w:pPr>
+            <w:r>
+              <w:rPr>
+                <w:rFonts w:ascii="Arial" w:cs="Arial" w:eastAsia="Arial" w:hAnsi="Arial"/>
+                <w:b w:val="false"/>
+                <w:bCs w:val="false"/>
+                <w:color w:val="1F2933"/>
+                <w:sz w:val="19"/>
+                <w:szCs w:val="19"/>
+              </w:rPr>
+              <w:t xml:space="preserve">Backups need a paid plan</w:t>
+            </w:r>
+          </w:p>
+        </w:tc>
+        <w:tc>
+          <w:tcPr>
+            <w:tcW w:type="dxa" w:w="5460"/>
+            <w:tcBorders>
+              <w:top w:val="single" w:color="D5DAE0" w:sz="4"/>
+              <w:left w:val="single" w:color="D5DAE0" w:sz="4"/>
+              <w:bottom w:val="single" w:color="D5DAE0" w:sz="4"/>
+              <w:right w:val="single" w:color="D5DAE0" w:sz="4"/>
+            </w:tcBorders>
+            <w:tcMar>
+              <w:top w:type="dxa" w:w="70"/>
+              <w:left w:type="dxa" w:w="110"/>
+              <w:bottom w:type="dxa" w:w="70"/>
+              <w:right w:type="dxa" w:w="110"/>
+            </w:tcMar>
+          </w:tcPr>
+          <w:p>
+            <w:pPr>
+              <w:spacing w:after="0" w:line="270"/>
+            </w:pPr>
+            <w:r>
+              <w:rPr>
+                <w:rFonts w:ascii="Arial" w:cs="Arial" w:eastAsia="Arial" w:hAnsi="Arial"/>
+                <w:b w:val="false"/>
+                <w:bCs w:val="false"/>
+                <w:color w:val="1F2933"/>
+                <w:sz w:val="19"/>
+                <w:szCs w:val="19"/>
+              </w:rPr>
+              <w:t xml:space="preserve">Nightly JSON dump to storage you control</w:t>
+            </w:r>
+          </w:p>
+        </w:tc>
+      </w:tr>
+      <w:tr>
+        <w:trPr>
+          <w:cantSplit/>
+          <w:tblHeader w:val="false"/>
+        </w:trPr>
+        <w:tc>
+          <w:tcPr>
+            <w:tcW w:type="dxa" w:w="500"/>
+            <w:tcBorders>
+              <w:top w:val="single" w:color="D5DAE0" w:sz="4"/>
+              <w:left w:val="single" w:color="D5DAE0" w:sz="4"/>
+              <w:bottom w:val="single" w:color="D5DAE0" w:sz="4"/>
+              <w:right w:val="single" w:color="D5DAE0" w:sz="4"/>
+            </w:tcBorders>
+            <w:tcMar>
+              <w:top w:type="dxa" w:w="70"/>
+              <w:left w:type="dxa" w:w="110"/>
+              <w:bottom w:type="dxa" w:w="70"/>
+              <w:right w:type="dxa" w:w="110"/>
+            </w:tcMar>
+          </w:tcPr>
+          <w:p>
+            <w:pPr>
+              <w:spacing w:after="0" w:line="270"/>
+            </w:pPr>
+            <w:r>
+              <w:rPr>
+                <w:rFonts w:ascii="Arial" w:cs="Arial" w:eastAsia="Arial" w:hAnsi="Arial"/>
+                <w:b w:val="false"/>
+                <w:bCs w:val="false"/>
+                <w:color w:val="1F2933"/>
+                <w:sz w:val="19"/>
+                <w:szCs w:val="19"/>
+              </w:rPr>
+              <w:t xml:space="preserve">7</w:t>
+            </w:r>
+          </w:p>
+        </w:tc>
+        <w:tc>
+          <w:tcPr>
+            <w:tcW w:type="dxa" w:w="3400"/>
+            <w:tcBorders>
+              <w:top w:val="single" w:color="D5DAE0" w:sz="4"/>
+              <w:left w:val="single" w:color="D5DAE0" w:sz="4"/>
+              <w:bottom w:val="single" w:color="D5DAE0" w:sz="4"/>
+              <w:right w:val="single" w:color="D5DAE0" w:sz="4"/>
+            </w:tcBorders>
+            <w:tcMar>
+              <w:top w:type="dxa" w:w="70"/>
+              <w:left w:type="dxa" w:w="110"/>
+              <w:bottom w:type="dxa" w:w="70"/>
+              <w:right w:type="dxa" w:w="110"/>
+            </w:tcMar>
+          </w:tcPr>
+          <w:p>
+            <w:pPr>
+              <w:spacing w:after="0" w:line="270"/>
+            </w:pPr>
+            <w:r>
+              <w:rPr>
+                <w:rFonts w:ascii="Arial" w:cs="Arial" w:eastAsia="Arial" w:hAnsi="Arial"/>
+                <w:b w:val="false"/>
+                <w:bCs w:val="false"/>
+                <w:color w:val="1F2933"/>
+                <w:sz w:val="19"/>
+                <w:szCs w:val="19"/>
+              </w:rPr>
+              <w:t xml:space="preserve">Broker eligibility from India</w:t>
+            </w:r>
+          </w:p>
+        </w:tc>
+        <w:tc>
+          <w:tcPr>
+            <w:tcW w:type="dxa" w:w="5460"/>
+            <w:tcBorders>
+              <w:top w:val="single" w:color="D5DAE0" w:sz="4"/>
+              <w:left w:val="single" w:color="D5DAE0" w:sz="4"/>
+              <w:bottom w:val="single" w:color="D5DAE0" w:sz="4"/>
+              <w:right w:val="single" w:color="D5DAE0" w:sz="4"/>
+            </w:tcBorders>
+            <w:tcMar>
+              <w:top w:type="dxa" w:w="70"/>
+              <w:left w:type="dxa" w:w="110"/>
+              <w:bottom w:type="dxa" w:w="70"/>
+              <w:right w:type="dxa" w:w="110"/>
+            </w:tcMar>
+          </w:tcPr>
+          <w:p>
+            <w:pPr>
+              <w:spacing w:after="0" w:line="270"/>
+            </w:pPr>
+            <w:r>
+              <w:rPr>
+                <w:rFonts w:ascii="Arial" w:cs="Arial" w:eastAsia="Arial" w:hAnsi="Arial"/>
+                <w:b w:val="false"/>
+                <w:bCs w:val="false"/>
+                <w:color w:val="1F2933"/>
+                <w:sz w:val="19"/>
+                <w:szCs w:val="19"/>
+              </w:rPr>
+              <w:t xml:space="preserve">Verify before building toward live</w:t>
+            </w:r>
+          </w:p>
+        </w:tc>
+      </w:tr>
+    </w:tbl>
+    <w:p>
+      <w:pPr>
+        <w:pStyle w:val="Heading1"/>
+        <w:keepNext/>
+        <w:spacing w:after="120" w:before="360"/>
+      </w:pPr>
+      <w:r>
+        <w:rPr>
+          <w:rFonts w:ascii="Arial" w:cs="Arial" w:eastAsia="Arial" w:hAnsi="Arial"/>
+          <w:b/>
+          <w:bCs/>
+          <w:color w:val="1F6F5C"/>
+          <w:sz w:val="32"/>
+          <w:szCs w:val="32"/>
+        </w:rPr>
+        <w:t xml:space="preserve">8. Build plan</w:t>
       </w:r>
     </w:p>
     <w:tbl>
@@ -3827,7 +4884,7 @@
           <w:sz w:val="32"/>
           <w:szCs w:val="32"/>
         </w:rPr>
-        <w:t xml:space="preserve">8. Adding the skill and tools</w:t>
+        <w:t xml:space="preserve">9. Adding the skill and tools</w:t>
       </w:r>
     </w:p>
     <w:p>
@@ -3965,7 +5022,7 @@
           <w:sz w:val="32"/>
           <w:szCs w:val="32"/>
         </w:rPr>
-        <w:t xml:space="preserve">9. The files in this pack</w:t>
+        <w:t xml:space="preserve">10. The files in this pack</w:t>
       </w:r>
     </w:p>
     <w:tbl>
@@ -4652,7 +5709,7 @@
                 <w:sz w:val="19"/>
                 <w:szCs w:val="19"/>
               </w:rPr>
-              <w:t xml:space="preserve">TASKS.md (updated)</w:t>
+              <w:t xml:space="preserve">DESIGN.md (updated)</w:t>
             </w:r>
           </w:p>
         </w:tc>
@@ -4718,7 +5775,7 @@
                 <w:sz w:val="19"/>
                 <w:szCs w:val="19"/>
               </w:rPr>
-              <w:t xml:space="preserve">Bot tasks; S0-1 now uses bot/ and dashboard/</w:t>
+              <w:t xml:space="preserve">Adds observability, audit log and the architecture review (sections 13.2, 13.3, 18)</w:t>
             </w:r>
           </w:p>
         </w:tc>
@@ -4757,6 +5814,111 @@
                 <w:sz w:val="19"/>
                 <w:szCs w:val="19"/>
               </w:rPr>
+              <w:t xml:space="preserve">TASKS.md (updated)</w:t>
+            </w:r>
+          </w:p>
+        </w:tc>
+        <w:tc>
+          <w:tcPr>
+            <w:tcW w:type="dxa" w:w="3300"/>
+            <w:tcBorders>
+              <w:top w:val="single" w:color="D5DAE0" w:sz="4"/>
+              <w:left w:val="single" w:color="D5DAE0" w:sz="4"/>
+              <w:bottom w:val="single" w:color="D5DAE0" w:sz="4"/>
+              <w:right w:val="single" w:color="D5DAE0" w:sz="4"/>
+            </w:tcBorders>
+            <w:tcMar>
+              <w:top w:type="dxa" w:w="70"/>
+              <w:left w:type="dxa" w:w="110"/>
+              <w:bottom w:type="dxa" w:w="70"/>
+              <w:right w:type="dxa" w:w="110"/>
+            </w:tcMar>
+          </w:tcPr>
+          <w:p>
+            <w:pPr>
+              <w:spacing w:after="0" w:line="270"/>
+            </w:pPr>
+            <w:r>
+              <w:rPr>
+                <w:rFonts w:ascii="Arial" w:cs="Arial" w:eastAsia="Arial" w:hAnsi="Arial"/>
+                <w:b w:val="false"/>
+                <w:bCs w:val="false"/>
+                <w:color w:val="1F2933"/>
+                <w:sz w:val="19"/>
+                <w:szCs w:val="19"/>
+              </w:rPr>
+              <w:t xml:space="preserve">docs/</w:t>
+            </w:r>
+          </w:p>
+        </w:tc>
+        <w:tc>
+          <w:tcPr>
+            <w:tcW w:type="dxa" w:w="3060"/>
+            <w:tcBorders>
+              <w:top w:val="single" w:color="D5DAE0" w:sz="4"/>
+              <w:left w:val="single" w:color="D5DAE0" w:sz="4"/>
+              <w:bottom w:val="single" w:color="D5DAE0" w:sz="4"/>
+              <w:right w:val="single" w:color="D5DAE0" w:sz="4"/>
+            </w:tcBorders>
+            <w:tcMar>
+              <w:top w:type="dxa" w:w="70"/>
+              <w:left w:type="dxa" w:w="110"/>
+              <w:bottom w:type="dxa" w:w="70"/>
+              <w:right w:type="dxa" w:w="110"/>
+            </w:tcMar>
+          </w:tcPr>
+          <w:p>
+            <w:pPr>
+              <w:spacing w:after="0" w:line="270"/>
+            </w:pPr>
+            <w:r>
+              <w:rPr>
+                <w:rFonts w:ascii="Arial" w:cs="Arial" w:eastAsia="Arial" w:hAnsi="Arial"/>
+                <w:b w:val="false"/>
+                <w:bCs w:val="false"/>
+                <w:color w:val="1F2933"/>
+                <w:sz w:val="19"/>
+                <w:szCs w:val="19"/>
+              </w:rPr>
+              <w:t xml:space="preserve">Bot tasks; adds audit, fail-closed, idempotency and monitoring tasks</w:t>
+            </w:r>
+          </w:p>
+        </w:tc>
+      </w:tr>
+      <w:tr>
+        <w:trPr>
+          <w:cantSplit/>
+          <w:tblHeader w:val="false"/>
+        </w:trPr>
+        <w:tc>
+          <w:tcPr>
+            <w:tcW w:type="dxa" w:w="3000"/>
+            <w:tcBorders>
+              <w:top w:val="single" w:color="D5DAE0" w:sz="4"/>
+              <w:left w:val="single" w:color="D5DAE0" w:sz="4"/>
+              <w:bottom w:val="single" w:color="D5DAE0" w:sz="4"/>
+              <w:right w:val="single" w:color="D5DAE0" w:sz="4"/>
+            </w:tcBorders>
+            <w:tcMar>
+              <w:top w:type="dxa" w:w="70"/>
+              <w:left w:type="dxa" w:w="110"/>
+              <w:bottom w:type="dxa" w:w="70"/>
+              <w:right w:type="dxa" w:w="110"/>
+            </w:tcMar>
+          </w:tcPr>
+          <w:p>
+            <w:pPr>
+              <w:spacing w:after="0" w:line="270"/>
+            </w:pPr>
+            <w:r>
+              <w:rPr>
+                <w:rFonts w:ascii="Arial" w:cs="Arial" w:eastAsia="Arial" w:hAnsi="Arial"/>
+                <w:b w:val="false"/>
+                <w:bCs w:val="false"/>
+                <w:color w:val="1F2933"/>
+                <w:sz w:val="19"/>
+                <w:szCs w:val="19"/>
+              </w:rPr>
               <w:t xml:space="preserve">check_prereqs.sh</w:t>
             </w:r>
           </w:p>
@@ -4844,7 +6006,7 @@
           <w:sz w:val="32"/>
           <w:szCs w:val="32"/>
         </w:rPr>
-        <w:t xml:space="preserve">10. Open items</w:t>
+        <w:t xml:space="preserve">11. Open items</w:t>
       </w:r>
     </w:p>
     <w:p>

</xml_diff>